<commit_message>
updated the farm platform request form
</commit_message>
<xml_diff>
--- a/public/documents/Farm Platform Access Request Form.docx
+++ b/public/documents/Farm Platform Access Request Form.docx
@@ -1,6 +1,6 @@
 
 <file path=word/document.xml><?xml version="1.0" encoding="utf-8"?>
-<w:document xmlns:wpc="http://schemas.microsoft.com/office/word/2010/wordprocessingCanvas" xmlns:cx="http://schemas.microsoft.com/office/drawing/2014/chartex" xmlns:cx1="http://schemas.microsoft.com/office/drawing/2015/9/8/chartex" xmlns:cx2="http://schemas.microsoft.com/office/drawing/2015/10/21/chartex" xmlns:cx3="http://schemas.microsoft.com/office/drawing/2016/5/9/chartex" xmlns:cx4="http://schemas.microsoft.com/office/drawing/2016/5/10/chartex" xmlns:cx5="http://schemas.microsoft.com/office/drawing/2016/5/11/chartex" xmlns:cx6="http://schemas.microsoft.com/office/drawing/2016/5/12/chartex" xmlns:cx7="http://schemas.microsoft.com/office/drawing/2016/5/13/chartex" xmlns:cx8="http://schemas.microsoft.com/office/drawing/2016/5/14/chartex" xmlns:mc="http://schemas.openxmlformats.org/markup-compatibility/2006" xmlns:aink="http://schemas.microsoft.com/office/drawing/2016/ink" xmlns:am3d="http://schemas.microsoft.com/office/drawing/2017/model3d" xmlns:o="urn:schemas-microsoft-com:office:office" xmlns:oel="http://schemas.microsoft.com/office/2019/extlst" xmlns:r="http://schemas.openxmlformats.org/officeDocument/2006/relationships" xmlns:m="http://schemas.openxmlformats.org/officeDocument/2006/math" xmlns:v="urn:schemas-microsoft-com:vml" xmlns:wp14="http://schemas.microsoft.com/office/word/2010/wordprocessingDrawing" xmlns:wp="http://schemas.openxmlformats.org/drawingml/2006/wordprocessingDrawing" xmlns:w10="urn:schemas-microsoft-com:office:word" xmlns:w="http://schemas.openxmlformats.org/wordprocessingml/2006/main" xmlns:w14="http://schemas.microsoft.com/office/word/2010/wordml" xmlns:w15="http://schemas.microsoft.com/office/word/2012/wordml" xmlns:w16cex="http://schemas.microsoft.com/office/word/2018/wordml/cex" xmlns:w16cid="http://schemas.microsoft.com/office/word/2016/wordml/cid" xmlns:w16="http://schemas.microsoft.com/office/word/2018/wordml" xmlns:w16sdtdh="http://schemas.microsoft.com/office/word/2020/wordml/sdtdatahash" xmlns:w16se="http://schemas.microsoft.com/office/word/2015/wordml/symex" xmlns:wpg="http://schemas.microsoft.com/office/word/2010/wordprocessingGroup" xmlns:wpi="http://schemas.microsoft.com/office/word/2010/wordprocessingInk" xmlns:wne="http://schemas.microsoft.com/office/word/2006/wordml" xmlns:wps="http://schemas.microsoft.com/office/word/2010/wordprocessingShape" mc:Ignorable="w14 w15 w16se w16cid w16 w16cex w16sdtdh wp14">
+<w:document xmlns:wpc="http://schemas.microsoft.com/office/word/2010/wordprocessingCanvas" xmlns:cx="http://schemas.microsoft.com/office/drawing/2014/chartex" xmlns:cx1="http://schemas.microsoft.com/office/drawing/2015/9/8/chartex" xmlns:cx2="http://schemas.microsoft.com/office/drawing/2015/10/21/chartex" xmlns:cx3="http://schemas.microsoft.com/office/drawing/2016/5/9/chartex" xmlns:cx4="http://schemas.microsoft.com/office/drawing/2016/5/10/chartex" xmlns:cx5="http://schemas.microsoft.com/office/drawing/2016/5/11/chartex" xmlns:cx6="http://schemas.microsoft.com/office/drawing/2016/5/12/chartex" xmlns:cx7="http://schemas.microsoft.com/office/drawing/2016/5/13/chartex" xmlns:cx8="http://schemas.microsoft.com/office/drawing/2016/5/14/chartex" xmlns:mc="http://schemas.openxmlformats.org/markup-compatibility/2006" xmlns:aink="http://schemas.microsoft.com/office/drawing/2016/ink" xmlns:am3d="http://schemas.microsoft.com/office/drawing/2017/model3d" xmlns:o="urn:schemas-microsoft-com:office:office" xmlns:oel="http://schemas.microsoft.com/office/2019/extlst" xmlns:r="http://schemas.openxmlformats.org/officeDocument/2006/relationships" xmlns:m="http://schemas.openxmlformats.org/officeDocument/2006/math" xmlns:v="urn:schemas-microsoft-com:vml" xmlns:wp14="http://schemas.microsoft.com/office/word/2010/wordprocessingDrawing" xmlns:wp="http://schemas.openxmlformats.org/drawingml/2006/wordprocessingDrawing" xmlns:w10="urn:schemas-microsoft-com:office:word" xmlns:w="http://schemas.openxmlformats.org/wordprocessingml/2006/main" xmlns:w14="http://schemas.microsoft.com/office/word/2010/wordml" xmlns:w15="http://schemas.microsoft.com/office/word/2012/wordml" xmlns:w16cex="http://schemas.microsoft.com/office/word/2018/wordml/cex" xmlns:w16cid="http://schemas.microsoft.com/office/word/2016/wordml/cid" xmlns:w16="http://schemas.microsoft.com/office/word/2018/wordml" xmlns:w16du="http://schemas.microsoft.com/office/word/2023/wordml/word16du" xmlns:w16sdtdh="http://schemas.microsoft.com/office/word/2020/wordml/sdtdatahash" xmlns:w16sdtfl="http://schemas.microsoft.com/office/word/2024/wordml/sdtformatlock" xmlns:w16se="http://schemas.microsoft.com/office/word/2015/wordml/symex" xmlns:wpg="http://schemas.microsoft.com/office/word/2010/wordprocessingGroup" xmlns:wpi="http://schemas.microsoft.com/office/word/2010/wordprocessingInk" xmlns:wne="http://schemas.microsoft.com/office/word/2006/wordml" xmlns:wps="http://schemas.microsoft.com/office/word/2010/wordprocessingShape" mc:Ignorable="w14 w15 w16se w16cid w16 w16cex w16sdtdh w16sdtfl w16du wp14">
   <w:body>
     <w:p>
       <w:pPr>
@@ -239,6 +239,13 @@
           <w:rFonts w:ascii="Arial" w:hAnsi="Arial" w:cs="Arial"/>
           <w:sz w:val="20"/>
         </w:rPr>
+        <w:t xml:space="preserve"> (FP)</w:t>
+      </w:r>
+      <w:r>
+        <w:rPr>
+          <w:rFonts w:ascii="Arial" w:hAnsi="Arial" w:cs="Arial"/>
+          <w:sz w:val="20"/>
+        </w:rPr>
         <w:t xml:space="preserve">, including consideration by our Farm Platform </w:t>
       </w:r>
       <w:r>
@@ -246,7 +253,14 @@
           <w:rFonts w:ascii="Arial" w:hAnsi="Arial" w:cs="Arial"/>
           <w:sz w:val="20"/>
         </w:rPr>
-        <w:t xml:space="preserve">Management </w:t>
+        <w:t>Operations</w:t>
+      </w:r>
+      <w:r>
+        <w:rPr>
+          <w:rFonts w:ascii="Arial" w:hAnsi="Arial" w:cs="Arial"/>
+          <w:sz w:val="20"/>
+        </w:rPr>
+        <w:t xml:space="preserve"> </w:t>
       </w:r>
       <w:r>
         <w:rPr>
@@ -556,61 +570,7 @@
                                 <w:i/>
                                 <w:sz w:val="20"/>
                               </w:rPr>
-                              <w:t xml:space="preserve">R.J. Orr, P.J. Murray, C.J. Eyles, M.S.A. Blackwell, L.M. Cardenas, A.L. Collins, J.A.J. Dungait, K.W.T. Goulding, B.A. Griffith, S.J. </w:t>
-                            </w:r>
-                            <w:proofErr w:type="spellStart"/>
-                            <w:r>
-                              <w:rPr>
-                                <w:rFonts w:ascii="Arial" w:hAnsi="Arial" w:cs="Arial"/>
-                                <w:i/>
-                                <w:sz w:val="20"/>
-                              </w:rPr>
-                              <w:t>Gurr</w:t>
-                            </w:r>
-                            <w:proofErr w:type="spellEnd"/>
-                            <w:r>
-                              <w:rPr>
-                                <w:rFonts w:ascii="Arial" w:hAnsi="Arial" w:cs="Arial"/>
-                                <w:i/>
-                                <w:sz w:val="20"/>
-                              </w:rPr>
-                              <w:t xml:space="preserve">, P. Harris, J.M.B. Hawkins, T.H. Misselbrook, C. Rawlings, A. Shepherd, H. Sint, T. Takahashi, K.N. Tozer, A.P. Whitmore, L. </w:t>
-                            </w:r>
-                            <w:proofErr w:type="gramStart"/>
-                            <w:r>
-                              <w:rPr>
-                                <w:rFonts w:ascii="Arial" w:hAnsi="Arial" w:cs="Arial"/>
-                                <w:i/>
-                                <w:sz w:val="20"/>
-                              </w:rPr>
-                              <w:t>Wu</w:t>
-                            </w:r>
-                            <w:proofErr w:type="gramEnd"/>
-                            <w:r>
-                              <w:rPr>
-                                <w:rFonts w:ascii="Arial" w:hAnsi="Arial" w:cs="Arial"/>
-                                <w:i/>
-                                <w:sz w:val="20"/>
-                              </w:rPr>
-                              <w:t xml:space="preserve"> and M.R.F. Lee. (2016). The North Wyke Farm Platform: effect of temperate grassland farming systems on soil moisture contents, </w:t>
-                            </w:r>
-                            <w:proofErr w:type="gramStart"/>
-                            <w:r>
-                              <w:rPr>
-                                <w:rFonts w:ascii="Arial" w:hAnsi="Arial" w:cs="Arial"/>
-                                <w:i/>
-                                <w:sz w:val="20"/>
-                              </w:rPr>
-                              <w:t>runoff</w:t>
-                            </w:r>
-                            <w:proofErr w:type="gramEnd"/>
-                            <w:r>
-                              <w:rPr>
-                                <w:rFonts w:ascii="Arial" w:hAnsi="Arial" w:cs="Arial"/>
-                                <w:i/>
-                                <w:sz w:val="20"/>
-                              </w:rPr>
-                              <w:t xml:space="preserve"> and associated water quality dynamics. European Journal of Soil Science, 67, 374-385.</w:t>
+                              <w:t>R.J. Orr, P.J. Murray, C.J. Eyles, M.S.A. Blackwell, L.M. Cardenas, A.L. Collins, J.A.J. Dungait, K.W.T. Goulding, B.A. Griffith, S.J. Gurr, P. Harris, J.M.B. Hawkins, T.H. Misselbrook, C. Rawlings, A. Shepherd, H. Sint, T. Takahashi, K.N. Tozer, A.P. Whitmore, L. Wu and M.R.F. Lee. (2016). The North Wyke Farm Platform: effect of temperate grassland farming systems on soil moisture contents, runoff and associated water quality dynamics. European Journal of Soil Science, 67, 374-385.</w:t>
                             </w:r>
                           </w:p>
                           <w:p>
@@ -690,7 +650,8 @@
                               <w:jc w:val="left"/>
                               <w:rPr>
                                 <w:rFonts w:ascii="Arial" w:hAnsi="Arial" w:cs="Arial"/>
-                                <w:sz w:val="20"/>
+                                <w:i/>
+                                <w:iCs/>
                               </w:rPr>
                             </w:pPr>
                             <w:hyperlink r:id="rId10" w:history="1">
@@ -698,9 +659,10 @@
                                 <w:rPr>
                                   <w:rStyle w:val="Hyperlink"/>
                                   <w:rFonts w:ascii="Arial" w:hAnsi="Arial" w:cs="Arial"/>
-                                  <w:sz w:val="20"/>
+                                  <w:i/>
+                                  <w:iCs/>
                                 </w:rPr>
-                                <w:t>http://resources.rothamsted.ac.uk/farmplatform</w:t>
+                                <w:t>https://nwfp.rothamsted.ac.uk/</w:t>
                               </w:r>
                             </w:hyperlink>
                           </w:p>
@@ -992,61 +954,7 @@
                           <w:i/>
                           <w:sz w:val="20"/>
                         </w:rPr>
-                        <w:t xml:space="preserve">R.J. Orr, P.J. Murray, C.J. Eyles, M.S.A. Blackwell, L.M. Cardenas, A.L. Collins, J.A.J. Dungait, K.W.T. Goulding, B.A. Griffith, S.J. </w:t>
-                      </w:r>
-                      <w:proofErr w:type="spellStart"/>
-                      <w:r>
-                        <w:rPr>
-                          <w:rFonts w:ascii="Arial" w:hAnsi="Arial" w:cs="Arial"/>
-                          <w:i/>
-                          <w:sz w:val="20"/>
-                        </w:rPr>
-                        <w:t>Gurr</w:t>
-                      </w:r>
-                      <w:proofErr w:type="spellEnd"/>
-                      <w:r>
-                        <w:rPr>
-                          <w:rFonts w:ascii="Arial" w:hAnsi="Arial" w:cs="Arial"/>
-                          <w:i/>
-                          <w:sz w:val="20"/>
-                        </w:rPr>
-                        <w:t xml:space="preserve">, P. Harris, J.M.B. Hawkins, T.H. Misselbrook, C. Rawlings, A. Shepherd, H. Sint, T. Takahashi, K.N. Tozer, A.P. Whitmore, L. </w:t>
-                      </w:r>
-                      <w:proofErr w:type="gramStart"/>
-                      <w:r>
-                        <w:rPr>
-                          <w:rFonts w:ascii="Arial" w:hAnsi="Arial" w:cs="Arial"/>
-                          <w:i/>
-                          <w:sz w:val="20"/>
-                        </w:rPr>
-                        <w:t>Wu</w:t>
-                      </w:r>
-                      <w:proofErr w:type="gramEnd"/>
-                      <w:r>
-                        <w:rPr>
-                          <w:rFonts w:ascii="Arial" w:hAnsi="Arial" w:cs="Arial"/>
-                          <w:i/>
-                          <w:sz w:val="20"/>
-                        </w:rPr>
-                        <w:t xml:space="preserve"> and M.R.F. Lee. (2016). The North Wyke Farm Platform: effect of temperate grassland farming systems on soil moisture contents, </w:t>
-                      </w:r>
-                      <w:proofErr w:type="gramStart"/>
-                      <w:r>
-                        <w:rPr>
-                          <w:rFonts w:ascii="Arial" w:hAnsi="Arial" w:cs="Arial"/>
-                          <w:i/>
-                          <w:sz w:val="20"/>
-                        </w:rPr>
-                        <w:t>runoff</w:t>
-                      </w:r>
-                      <w:proofErr w:type="gramEnd"/>
-                      <w:r>
-                        <w:rPr>
-                          <w:rFonts w:ascii="Arial" w:hAnsi="Arial" w:cs="Arial"/>
-                          <w:i/>
-                          <w:sz w:val="20"/>
-                        </w:rPr>
-                        <w:t xml:space="preserve"> and associated water quality dynamics. European Journal of Soil Science, 67, 374-385.</w:t>
+                        <w:t>R.J. Orr, P.J. Murray, C.J. Eyles, M.S.A. Blackwell, L.M. Cardenas, A.L. Collins, J.A.J. Dungait, K.W.T. Goulding, B.A. Griffith, S.J. Gurr, P. Harris, J.M.B. Hawkins, T.H. Misselbrook, C. Rawlings, A. Shepherd, H. Sint, T. Takahashi, K.N. Tozer, A.P. Whitmore, L. Wu and M.R.F. Lee. (2016). The North Wyke Farm Platform: effect of temperate grassland farming systems on soil moisture contents, runoff and associated water quality dynamics. European Journal of Soil Science, 67, 374-385.</w:t>
                       </w:r>
                     </w:p>
                     <w:p>
@@ -1126,7 +1034,8 @@
                         <w:jc w:val="left"/>
                         <w:rPr>
                           <w:rFonts w:ascii="Arial" w:hAnsi="Arial" w:cs="Arial"/>
-                          <w:sz w:val="20"/>
+                          <w:i/>
+                          <w:iCs/>
                         </w:rPr>
                       </w:pPr>
                       <w:hyperlink r:id="rId11" w:history="1">
@@ -1134,9 +1043,10 @@
                           <w:rPr>
                             <w:rStyle w:val="Hyperlink"/>
                             <w:rFonts w:ascii="Arial" w:hAnsi="Arial" w:cs="Arial"/>
-                            <w:sz w:val="20"/>
+                            <w:i/>
+                            <w:iCs/>
                           </w:rPr>
-                          <w:t>http://resources.rothamsted.ac.uk/farmplatform</w:t>
+                          <w:t>https://nwfp.rothamsted.ac.uk/</w:t>
                         </w:r>
                       </w:hyperlink>
                     </w:p>
@@ -2035,23 +1945,47 @@
           <w:b/>
           <w:sz w:val="20"/>
         </w:rPr>
-        <w:t xml:space="preserve">state if the CIEL 2% levy has been charged and </w:t>
-      </w:r>
-      <w:r>
-        <w:rPr>
-          <w:rFonts w:ascii="Arial" w:hAnsi="Arial" w:cs="Arial"/>
-          <w:b/>
-          <w:sz w:val="20"/>
-        </w:rPr>
-        <w:t>from</w:t>
-      </w:r>
-      <w:r>
-        <w:rPr>
-          <w:rFonts w:ascii="Arial" w:hAnsi="Arial" w:cs="Arial"/>
-          <w:b/>
-          <w:sz w:val="20"/>
-        </w:rPr>
-        <w:t xml:space="preserve"> what project:</w:t>
+        <w:t xml:space="preserve">state if </w:t>
+      </w:r>
+      <w:r>
+        <w:rPr>
+          <w:rFonts w:ascii="Arial" w:hAnsi="Arial" w:cs="Arial"/>
+          <w:b/>
+          <w:sz w:val="20"/>
+        </w:rPr>
+        <w:t xml:space="preserve">any legal requirements are necessary (e.g., installation of permanent </w:t>
+      </w:r>
+      <w:r>
+        <w:rPr>
+          <w:rFonts w:ascii="Arial" w:hAnsi="Arial" w:cs="Arial"/>
+          <w:b/>
+          <w:sz w:val="20"/>
+        </w:rPr>
+        <w:t xml:space="preserve">/ semi-permanent </w:t>
+      </w:r>
+      <w:r>
+        <w:rPr>
+          <w:rFonts w:ascii="Arial" w:hAnsi="Arial" w:cs="Arial"/>
+          <w:b/>
+          <w:sz w:val="20"/>
+        </w:rPr>
+        <w:t>sensor</w:t>
+      </w:r>
+      <w:r>
+        <w:rPr>
+          <w:rFonts w:ascii="Arial" w:hAnsi="Arial" w:cs="Arial"/>
+          <w:b/>
+          <w:sz w:val="20"/>
+        </w:rPr>
+        <w:t xml:space="preserve"> kits</w:t>
+      </w:r>
+      <w:r>
+        <w:rPr>
+          <w:rFonts w:ascii="Arial" w:hAnsi="Arial" w:cs="Arial"/>
+          <w:b/>
+          <w:sz w:val="20"/>
+        </w:rPr>
+        <w:t>):</w:t>
       </w:r>
     </w:p>
     <w:tbl>
@@ -3056,6 +2990,7 @@
           <w:rFonts w:ascii="Arial" w:hAnsi="Arial" w:cs="Arial"/>
           <w:sz w:val="20"/>
         </w:rPr>
+        <w:lastRenderedPageBreak/>
         <w:t>Contact</w:t>
       </w:r>
       <w:r>
@@ -3079,7 +3014,7 @@
             <w:rFonts w:ascii="Arial" w:hAnsi="Arial" w:cs="Arial"/>
             <w:sz w:val="20"/>
           </w:rPr>
-          <w:t>lou.davey@rothamsted.ac.uk</w:t>
+          <w:t>lisa.perryman@rothamsted.ac.uk</w:t>
         </w:r>
       </w:hyperlink>
       <w:r>
@@ -3223,7 +3158,6 @@
           <w:i/>
           <w:sz w:val="20"/>
         </w:rPr>
-        <w:lastRenderedPageBreak/>
         <w:t>Data availability</w:t>
       </w:r>
     </w:p>
@@ -3255,7 +3189,7 @@
           <w:szCs w:val="22"/>
           <w:shd w:val="clear" w:color="auto" w:fill="FFFFFF"/>
         </w:rPr>
-        <w:t>The NWFP is a publicly funded research infrastructure</w:t>
+        <w:t>The FP is a publicly funded research infrastructure</w:t>
       </w:r>
       <w:r>
         <w:rPr>
@@ -3277,7 +3211,7 @@
           <w:szCs w:val="22"/>
           <w:shd w:val="clear" w:color="auto" w:fill="FFFFFF"/>
         </w:rPr>
-        <w:t xml:space="preserve"> therefore all datasets generated from the NWFP must be made openly available.</w:t>
+        <w:t xml:space="preserve"> therefore all datasets generated from the FP must be made openly available.</w:t>
       </w:r>
       <w:r>
         <w:rPr>
@@ -3323,7 +3257,7 @@
           <w:szCs w:val="22"/>
           <w:shd w:val="clear" w:color="auto" w:fill="FFFFFF"/>
         </w:rPr>
-        <w:t>Researchers wishing to use the NWFP should note:</w:t>
+        <w:t>Researchers wishing to use the FP should note:</w:t>
       </w:r>
     </w:p>
     <w:p>
@@ -3510,7 +3444,7 @@
           <w:sz w:val="22"/>
           <w:szCs w:val="22"/>
         </w:rPr>
-        <w:t xml:space="preserve">After submitting this form, the NWFP data steward will contact you to develop a data management plan. This will contain details such as the type and volume of data to be collected, how metadata will be recorded, where (meta)data will be stored, and expected time frame for sharing. If the access request </w:t>
+        <w:t xml:space="preserve">After submitting this form, the FP data steward will contact you to develop a data management plan. This will contain details such as the type and volume of data to be collected, how metadata will be recorded, where (meta)data will be stored, and expected time frame for sharing. If the access request </w:t>
       </w:r>
       <w:r>
         <w:rPr>
@@ -3577,7 +3511,7 @@
           <w:sz w:val="22"/>
           <w:szCs w:val="22"/>
         </w:rPr>
-        <w:t>the NWFP data steward</w:t>
+        <w:t>the FP data steward</w:t>
       </w:r>
       <w:r>
         <w:rPr>
@@ -3637,164 +3571,9 @@
           <w:sz w:val="22"/>
           <w:szCs w:val="22"/>
         </w:rPr>
-        <w:t>Please be aware that by accessing the NWFP you are agreeing to this policy, and that the NWFP reserve the right to deny further access to researchers who fail to abide it.</w:t>
-      </w:r>
-    </w:p>
-    <w:p>
-      <w:pPr>
-        <w:ind w:left="360"/>
-        <w:jc w:val="center"/>
-        <w:rPr>
-          <w:rFonts w:asciiTheme="minorHAnsi" w:hAnsiTheme="minorHAnsi"/>
-          <w:b/>
-          <w:color w:val="000000" w:themeColor="text1"/>
-          <w:sz w:val="32"/>
-          <w:szCs w:val="32"/>
-        </w:rPr>
-      </w:pPr>
-    </w:p>
-    <w:p>
-      <w:pPr>
-        <w:ind w:left="360"/>
-        <w:jc w:val="center"/>
-        <w:rPr>
-          <w:rFonts w:asciiTheme="minorHAnsi" w:hAnsiTheme="minorHAnsi"/>
-          <w:b/>
-          <w:color w:val="000000" w:themeColor="text1"/>
-          <w:sz w:val="32"/>
-          <w:szCs w:val="32"/>
-        </w:rPr>
-      </w:pPr>
-    </w:p>
-    <w:p>
-      <w:pPr>
-        <w:ind w:left="360"/>
-        <w:jc w:val="center"/>
-        <w:rPr>
-          <w:rFonts w:asciiTheme="minorHAnsi" w:hAnsiTheme="minorHAnsi"/>
-          <w:b/>
-          <w:color w:val="000000" w:themeColor="text1"/>
-          <w:sz w:val="32"/>
-          <w:szCs w:val="32"/>
-        </w:rPr>
-      </w:pPr>
-    </w:p>
-    <w:p>
-      <w:pPr>
-        <w:ind w:left="360"/>
-        <w:jc w:val="center"/>
-        <w:rPr>
-          <w:rFonts w:asciiTheme="minorHAnsi" w:hAnsiTheme="minorHAnsi"/>
-          <w:b/>
-          <w:color w:val="000000" w:themeColor="text1"/>
-          <w:sz w:val="32"/>
-          <w:szCs w:val="32"/>
-        </w:rPr>
-      </w:pPr>
-    </w:p>
-    <w:p>
-      <w:pPr>
-        <w:ind w:left="360"/>
-        <w:jc w:val="center"/>
-        <w:rPr>
-          <w:rFonts w:asciiTheme="minorHAnsi" w:hAnsiTheme="minorHAnsi"/>
-          <w:b/>
-          <w:color w:val="000000" w:themeColor="text1"/>
-          <w:sz w:val="32"/>
-          <w:szCs w:val="32"/>
-        </w:rPr>
-      </w:pPr>
-    </w:p>
-    <w:p>
-      <w:pPr>
-        <w:ind w:left="360"/>
-        <w:jc w:val="center"/>
-        <w:rPr>
-          <w:rFonts w:asciiTheme="minorHAnsi" w:hAnsiTheme="minorHAnsi"/>
-          <w:b/>
-          <w:color w:val="000000" w:themeColor="text1"/>
-          <w:sz w:val="32"/>
-          <w:szCs w:val="32"/>
-        </w:rPr>
-      </w:pPr>
-    </w:p>
-    <w:p>
-      <w:pPr>
-        <w:ind w:left="360"/>
-        <w:jc w:val="center"/>
-        <w:rPr>
-          <w:rFonts w:asciiTheme="minorHAnsi" w:hAnsiTheme="minorHAnsi"/>
-          <w:b/>
-          <w:color w:val="000000" w:themeColor="text1"/>
-          <w:sz w:val="32"/>
-          <w:szCs w:val="32"/>
-        </w:rPr>
-      </w:pPr>
-    </w:p>
-    <w:p>
-      <w:pPr>
-        <w:ind w:left="360"/>
-        <w:jc w:val="center"/>
-        <w:rPr>
-          <w:rFonts w:asciiTheme="minorHAnsi" w:hAnsiTheme="minorHAnsi"/>
-          <w:b/>
-          <w:color w:val="000000" w:themeColor="text1"/>
-          <w:sz w:val="32"/>
-          <w:szCs w:val="32"/>
-        </w:rPr>
-      </w:pPr>
-    </w:p>
-    <w:p>
-      <w:pPr>
-        <w:ind w:left="360"/>
-        <w:jc w:val="center"/>
-        <w:rPr>
-          <w:rFonts w:asciiTheme="minorHAnsi" w:hAnsiTheme="minorHAnsi"/>
-          <w:b/>
-          <w:color w:val="000000" w:themeColor="text1"/>
-          <w:sz w:val="32"/>
-          <w:szCs w:val="32"/>
-        </w:rPr>
-      </w:pPr>
-    </w:p>
-    <w:p>
-      <w:pPr>
-        <w:ind w:left="360"/>
-        <w:jc w:val="center"/>
-        <w:rPr>
-          <w:rFonts w:asciiTheme="minorHAnsi" w:hAnsiTheme="minorHAnsi"/>
-          <w:b/>
-          <w:color w:val="000000" w:themeColor="text1"/>
-          <w:sz w:val="32"/>
-          <w:szCs w:val="32"/>
-        </w:rPr>
-      </w:pPr>
-    </w:p>
-    <w:p>
-      <w:pPr>
-        <w:ind w:left="360"/>
-        <w:jc w:val="center"/>
-        <w:rPr>
-          <w:rFonts w:asciiTheme="minorHAnsi" w:hAnsiTheme="minorHAnsi"/>
-          <w:b/>
-          <w:color w:val="000000" w:themeColor="text1"/>
-          <w:sz w:val="32"/>
-          <w:szCs w:val="32"/>
-        </w:rPr>
-      </w:pPr>
-    </w:p>
-    <w:p>
-      <w:pPr>
-        <w:ind w:left="360"/>
-        <w:jc w:val="center"/>
-        <w:rPr>
-          <w:rFonts w:asciiTheme="minorHAnsi" w:hAnsiTheme="minorHAnsi"/>
-          <w:b/>
-          <w:color w:val="000000" w:themeColor="text1"/>
-          <w:sz w:val="32"/>
-          <w:szCs w:val="32"/>
-        </w:rPr>
-      </w:pPr>
+        <w:lastRenderedPageBreak/>
+        <w:t>Please be aware that by accessing the FP you are agreeing to this policy, and that the FP reserve the right to deny further access to researchers who fail to abide it.</w:t>
+      </w:r>
     </w:p>
     <w:p>
       <w:pPr>
@@ -3845,7 +3624,7 @@
     </w:p>
     <w:p>
       <w:pPr>
-        <w:jc w:val="left"/>
+        <w:jc w:val="center"/>
         <w:rPr>
           <w:rFonts w:ascii="Arial" w:hAnsi="Arial" w:cs="Arial"/>
           <w:b/>
@@ -3861,9 +3640,9 @@
           <w:lang w:eastAsia="en-GB"/>
         </w:rPr>
         <w:drawing>
-          <wp:inline distT="0" distB="0" distL="0" distR="0" wp14:anchorId="5B555055" wp14:editId="72F7C0F1">
-            <wp:extent cx="5794427" cy="8188657"/>
-            <wp:effectExtent l="19050" t="19050" r="15875" b="22225"/>
+          <wp:inline distT="0" distB="0" distL="0" distR="0" wp14:anchorId="5B555055" wp14:editId="0E8C94C8">
+            <wp:extent cx="4836540" cy="6834974"/>
+            <wp:effectExtent l="19050" t="19050" r="21590" b="23495"/>
             <wp:docPr id="3" name="Picture 3"/>
             <wp:cNvGraphicFramePr>
               <a:graphicFrameLocks xmlns:a="http://schemas.openxmlformats.org/drawingml/2006/main" noChangeAspect="1"/>
@@ -3890,7 +3669,7 @@
                   <pic:spPr>
                     <a:xfrm>
                       <a:off x="0" y="0"/>
-                      <a:ext cx="5796660" cy="8191812"/>
+                      <a:ext cx="4842804" cy="6843827"/>
                     </a:xfrm>
                     <a:prstGeom prst="rect">
                       <a:avLst/>
@@ -3947,7 +3726,7 @@
         </w:rPr>
         <w:lastRenderedPageBreak/>
         <w:drawing>
-          <wp:inline distT="0" distB="0" distL="0" distR="0" wp14:anchorId="25B1C541" wp14:editId="2FE91113">
+          <wp:inline distT="0" distB="0" distL="0" distR="0" wp14:anchorId="25B1C541" wp14:editId="526D3E3C">
             <wp:extent cx="5871686" cy="8297839"/>
             <wp:effectExtent l="19050" t="19050" r="15240" b="27305"/>
             <wp:docPr id="4" name="Picture 4"/>
@@ -4023,7 +3802,7 @@
         </w:rPr>
         <w:lastRenderedPageBreak/>
         <w:drawing>
-          <wp:inline distT="0" distB="0" distL="0" distR="0" wp14:anchorId="1B40E42A" wp14:editId="237DE611">
+          <wp:inline distT="0" distB="0" distL="0" distR="0" wp14:anchorId="1B40E42A" wp14:editId="24AB15BA">
             <wp:extent cx="5862029" cy="8284191"/>
             <wp:effectExtent l="19050" t="19050" r="24765" b="22225"/>
             <wp:docPr id="8" name="Picture 8"/>
@@ -4097,7 +3876,7 @@
         </w:rPr>
         <w:lastRenderedPageBreak/>
         <w:drawing>
-          <wp:inline distT="0" distB="0" distL="0" distR="0" wp14:anchorId="2FEFE69B" wp14:editId="216E8647">
+          <wp:inline distT="0" distB="0" distL="0" distR="0" wp14:anchorId="2FEFE69B" wp14:editId="5CE6FDFF">
             <wp:extent cx="5842714" cy="8256895"/>
             <wp:effectExtent l="19050" t="19050" r="24765" b="11430"/>
             <wp:docPr id="9" name="Picture 9"/>
@@ -4170,7 +3949,7 @@
 </file>
 
 <file path=word/endnotes.xml><?xml version="1.0" encoding="utf-8"?>
-<w:endnotes xmlns:wpc="http://schemas.microsoft.com/office/word/2010/wordprocessingCanvas" xmlns:cx="http://schemas.microsoft.com/office/drawing/2014/chartex" xmlns:cx1="http://schemas.microsoft.com/office/drawing/2015/9/8/chartex" xmlns:cx2="http://schemas.microsoft.com/office/drawing/2015/10/21/chartex" xmlns:cx3="http://schemas.microsoft.com/office/drawing/2016/5/9/chartex" xmlns:cx4="http://schemas.microsoft.com/office/drawing/2016/5/10/chartex" xmlns:cx5="http://schemas.microsoft.com/office/drawing/2016/5/11/chartex" xmlns:cx6="http://schemas.microsoft.com/office/drawing/2016/5/12/chartex" xmlns:cx7="http://schemas.microsoft.com/office/drawing/2016/5/13/chartex" xmlns:cx8="http://schemas.microsoft.com/office/drawing/2016/5/14/chartex" xmlns:mc="http://schemas.openxmlformats.org/markup-compatibility/2006" xmlns:aink="http://schemas.microsoft.com/office/drawing/2016/ink" xmlns:am3d="http://schemas.microsoft.com/office/drawing/2017/model3d" xmlns:o="urn:schemas-microsoft-com:office:office" xmlns:oel="http://schemas.microsoft.com/office/2019/extlst" xmlns:r="http://schemas.openxmlformats.org/officeDocument/2006/relationships" xmlns:m="http://schemas.openxmlformats.org/officeDocument/2006/math" xmlns:v="urn:schemas-microsoft-com:vml" xmlns:wp14="http://schemas.microsoft.com/office/word/2010/wordprocessingDrawing" xmlns:wp="http://schemas.openxmlformats.org/drawingml/2006/wordprocessingDrawing" xmlns:w10="urn:schemas-microsoft-com:office:word" xmlns:w="http://schemas.openxmlformats.org/wordprocessingml/2006/main" xmlns:w14="http://schemas.microsoft.com/office/word/2010/wordml" xmlns:w15="http://schemas.microsoft.com/office/word/2012/wordml" xmlns:w16cex="http://schemas.microsoft.com/office/word/2018/wordml/cex" xmlns:w16cid="http://schemas.microsoft.com/office/word/2016/wordml/cid" xmlns:w16="http://schemas.microsoft.com/office/word/2018/wordml" xmlns:w16sdtdh="http://schemas.microsoft.com/office/word/2020/wordml/sdtdatahash" xmlns:w16se="http://schemas.microsoft.com/office/word/2015/wordml/symex" xmlns:wpg="http://schemas.microsoft.com/office/word/2010/wordprocessingGroup" xmlns:wpi="http://schemas.microsoft.com/office/word/2010/wordprocessingInk" xmlns:wne="http://schemas.microsoft.com/office/word/2006/wordml" xmlns:wps="http://schemas.microsoft.com/office/word/2010/wordprocessingShape" mc:Ignorable="w14 w15 w16se w16cid w16 w16cex w16sdtdh wp14">
+<w:endnotes xmlns:wpc="http://schemas.microsoft.com/office/word/2010/wordprocessingCanvas" xmlns:cx="http://schemas.microsoft.com/office/drawing/2014/chartex" xmlns:cx1="http://schemas.microsoft.com/office/drawing/2015/9/8/chartex" xmlns:cx2="http://schemas.microsoft.com/office/drawing/2015/10/21/chartex" xmlns:cx3="http://schemas.microsoft.com/office/drawing/2016/5/9/chartex" xmlns:cx4="http://schemas.microsoft.com/office/drawing/2016/5/10/chartex" xmlns:cx5="http://schemas.microsoft.com/office/drawing/2016/5/11/chartex" xmlns:cx6="http://schemas.microsoft.com/office/drawing/2016/5/12/chartex" xmlns:cx7="http://schemas.microsoft.com/office/drawing/2016/5/13/chartex" xmlns:cx8="http://schemas.microsoft.com/office/drawing/2016/5/14/chartex" xmlns:mc="http://schemas.openxmlformats.org/markup-compatibility/2006" xmlns:aink="http://schemas.microsoft.com/office/drawing/2016/ink" xmlns:am3d="http://schemas.microsoft.com/office/drawing/2017/model3d" xmlns:o="urn:schemas-microsoft-com:office:office" xmlns:oel="http://schemas.microsoft.com/office/2019/extlst" xmlns:r="http://schemas.openxmlformats.org/officeDocument/2006/relationships" xmlns:m="http://schemas.openxmlformats.org/officeDocument/2006/math" xmlns:v="urn:schemas-microsoft-com:vml" xmlns:wp14="http://schemas.microsoft.com/office/word/2010/wordprocessingDrawing" xmlns:wp="http://schemas.openxmlformats.org/drawingml/2006/wordprocessingDrawing" xmlns:w10="urn:schemas-microsoft-com:office:word" xmlns:w="http://schemas.openxmlformats.org/wordprocessingml/2006/main" xmlns:w14="http://schemas.microsoft.com/office/word/2010/wordml" xmlns:w15="http://schemas.microsoft.com/office/word/2012/wordml" xmlns:w16cex="http://schemas.microsoft.com/office/word/2018/wordml/cex" xmlns:w16cid="http://schemas.microsoft.com/office/word/2016/wordml/cid" xmlns:w16="http://schemas.microsoft.com/office/word/2018/wordml" xmlns:w16du="http://schemas.microsoft.com/office/word/2023/wordml/word16du" xmlns:w16sdtdh="http://schemas.microsoft.com/office/word/2020/wordml/sdtdatahash" xmlns:w16sdtfl="http://schemas.microsoft.com/office/word/2024/wordml/sdtformatlock" xmlns:w16se="http://schemas.microsoft.com/office/word/2015/wordml/symex" xmlns:wpg="http://schemas.microsoft.com/office/word/2010/wordprocessingGroup" xmlns:wpi="http://schemas.microsoft.com/office/word/2010/wordprocessingInk" xmlns:wne="http://schemas.microsoft.com/office/word/2006/wordml" xmlns:wps="http://schemas.microsoft.com/office/word/2010/wordprocessingShape" mc:Ignorable="w14 w15 w16se w16cid w16 w16cex w16sdtdh w16sdtfl w16du wp14">
   <w:endnote w:type="separator" w:id="-1">
     <w:p>
       <w:r>
@@ -4189,7 +3968,7 @@
 </file>
 
 <file path=word/footer1.xml><?xml version="1.0" encoding="utf-8"?>
-<w:ftr xmlns:wpc="http://schemas.microsoft.com/office/word/2010/wordprocessingCanvas" xmlns:cx="http://schemas.microsoft.com/office/drawing/2014/chartex" xmlns:cx1="http://schemas.microsoft.com/office/drawing/2015/9/8/chartex" xmlns:cx2="http://schemas.microsoft.com/office/drawing/2015/10/21/chartex" xmlns:cx3="http://schemas.microsoft.com/office/drawing/2016/5/9/chartex" xmlns:cx4="http://schemas.microsoft.com/office/drawing/2016/5/10/chartex" xmlns:cx5="http://schemas.microsoft.com/office/drawing/2016/5/11/chartex" xmlns:cx6="http://schemas.microsoft.com/office/drawing/2016/5/12/chartex" xmlns:cx7="http://schemas.microsoft.com/office/drawing/2016/5/13/chartex" xmlns:cx8="http://schemas.microsoft.com/office/drawing/2016/5/14/chartex" xmlns:mc="http://schemas.openxmlformats.org/markup-compatibility/2006" xmlns:aink="http://schemas.microsoft.com/office/drawing/2016/ink" xmlns:am3d="http://schemas.microsoft.com/office/drawing/2017/model3d" xmlns:o="urn:schemas-microsoft-com:office:office" xmlns:oel="http://schemas.microsoft.com/office/2019/extlst" xmlns:r="http://schemas.openxmlformats.org/officeDocument/2006/relationships" xmlns:m="http://schemas.openxmlformats.org/officeDocument/2006/math" xmlns:v="urn:schemas-microsoft-com:vml" xmlns:wp14="http://schemas.microsoft.com/office/word/2010/wordprocessingDrawing" xmlns:wp="http://schemas.openxmlformats.org/drawingml/2006/wordprocessingDrawing" xmlns:w10="urn:schemas-microsoft-com:office:word" xmlns:w="http://schemas.openxmlformats.org/wordprocessingml/2006/main" xmlns:w14="http://schemas.microsoft.com/office/word/2010/wordml" xmlns:w15="http://schemas.microsoft.com/office/word/2012/wordml" xmlns:w16cex="http://schemas.microsoft.com/office/word/2018/wordml/cex" xmlns:w16cid="http://schemas.microsoft.com/office/word/2016/wordml/cid" xmlns:w16="http://schemas.microsoft.com/office/word/2018/wordml" xmlns:w16sdtdh="http://schemas.microsoft.com/office/word/2020/wordml/sdtdatahash" xmlns:w16se="http://schemas.microsoft.com/office/word/2015/wordml/symex" xmlns:wpg="http://schemas.microsoft.com/office/word/2010/wordprocessingGroup" xmlns:wpi="http://schemas.microsoft.com/office/word/2010/wordprocessingInk" xmlns:wne="http://schemas.microsoft.com/office/word/2006/wordml" xmlns:wps="http://schemas.microsoft.com/office/word/2010/wordprocessingShape" mc:Ignorable="w14 w15 w16se w16cid w16 w16cex w16sdtdh wp14">
+<w:ftr xmlns:wpc="http://schemas.microsoft.com/office/word/2010/wordprocessingCanvas" xmlns:cx="http://schemas.microsoft.com/office/drawing/2014/chartex" xmlns:cx1="http://schemas.microsoft.com/office/drawing/2015/9/8/chartex" xmlns:cx2="http://schemas.microsoft.com/office/drawing/2015/10/21/chartex" xmlns:cx3="http://schemas.microsoft.com/office/drawing/2016/5/9/chartex" xmlns:cx4="http://schemas.microsoft.com/office/drawing/2016/5/10/chartex" xmlns:cx5="http://schemas.microsoft.com/office/drawing/2016/5/11/chartex" xmlns:cx6="http://schemas.microsoft.com/office/drawing/2016/5/12/chartex" xmlns:cx7="http://schemas.microsoft.com/office/drawing/2016/5/13/chartex" xmlns:cx8="http://schemas.microsoft.com/office/drawing/2016/5/14/chartex" xmlns:mc="http://schemas.openxmlformats.org/markup-compatibility/2006" xmlns:aink="http://schemas.microsoft.com/office/drawing/2016/ink" xmlns:am3d="http://schemas.microsoft.com/office/drawing/2017/model3d" xmlns:o="urn:schemas-microsoft-com:office:office" xmlns:oel="http://schemas.microsoft.com/office/2019/extlst" xmlns:r="http://schemas.openxmlformats.org/officeDocument/2006/relationships" xmlns:m="http://schemas.openxmlformats.org/officeDocument/2006/math" xmlns:v="urn:schemas-microsoft-com:vml" xmlns:wp14="http://schemas.microsoft.com/office/word/2010/wordprocessingDrawing" xmlns:wp="http://schemas.openxmlformats.org/drawingml/2006/wordprocessingDrawing" xmlns:w10="urn:schemas-microsoft-com:office:word" xmlns:w="http://schemas.openxmlformats.org/wordprocessingml/2006/main" xmlns:w14="http://schemas.microsoft.com/office/word/2010/wordml" xmlns:w15="http://schemas.microsoft.com/office/word/2012/wordml" xmlns:w16cex="http://schemas.microsoft.com/office/word/2018/wordml/cex" xmlns:w16cid="http://schemas.microsoft.com/office/word/2016/wordml/cid" xmlns:w16="http://schemas.microsoft.com/office/word/2018/wordml" xmlns:w16du="http://schemas.microsoft.com/office/word/2023/wordml/word16du" xmlns:w16sdtdh="http://schemas.microsoft.com/office/word/2020/wordml/sdtdatahash" xmlns:w16sdtfl="http://schemas.microsoft.com/office/word/2024/wordml/sdtformatlock" xmlns:w16se="http://schemas.microsoft.com/office/word/2015/wordml/symex" xmlns:wpg="http://schemas.microsoft.com/office/word/2010/wordprocessingGroup" xmlns:wpi="http://schemas.microsoft.com/office/word/2010/wordprocessingInk" xmlns:wne="http://schemas.microsoft.com/office/word/2006/wordml" xmlns:wps="http://schemas.microsoft.com/office/word/2010/wordprocessingShape" mc:Ignorable="w14 w15 w16se w16cid w16 w16cex w16sdtdh w16sdtfl w16du wp14">
   <w:p>
     <w:pPr>
       <w:pStyle w:val="Footer"/>
@@ -4216,7 +3995,7 @@
 </file>
 
 <file path=word/footnotes.xml><?xml version="1.0" encoding="utf-8"?>
-<w:footnotes xmlns:wpc="http://schemas.microsoft.com/office/word/2010/wordprocessingCanvas" xmlns:cx="http://schemas.microsoft.com/office/drawing/2014/chartex" xmlns:cx1="http://schemas.microsoft.com/office/drawing/2015/9/8/chartex" xmlns:cx2="http://schemas.microsoft.com/office/drawing/2015/10/21/chartex" xmlns:cx3="http://schemas.microsoft.com/office/drawing/2016/5/9/chartex" xmlns:cx4="http://schemas.microsoft.com/office/drawing/2016/5/10/chartex" xmlns:cx5="http://schemas.microsoft.com/office/drawing/2016/5/11/chartex" xmlns:cx6="http://schemas.microsoft.com/office/drawing/2016/5/12/chartex" xmlns:cx7="http://schemas.microsoft.com/office/drawing/2016/5/13/chartex" xmlns:cx8="http://schemas.microsoft.com/office/drawing/2016/5/14/chartex" xmlns:mc="http://schemas.openxmlformats.org/markup-compatibility/2006" xmlns:aink="http://schemas.microsoft.com/office/drawing/2016/ink" xmlns:am3d="http://schemas.microsoft.com/office/drawing/2017/model3d" xmlns:o="urn:schemas-microsoft-com:office:office" xmlns:oel="http://schemas.microsoft.com/office/2019/extlst" xmlns:r="http://schemas.openxmlformats.org/officeDocument/2006/relationships" xmlns:m="http://schemas.openxmlformats.org/officeDocument/2006/math" xmlns:v="urn:schemas-microsoft-com:vml" xmlns:wp14="http://schemas.microsoft.com/office/word/2010/wordprocessingDrawing" xmlns:wp="http://schemas.openxmlformats.org/drawingml/2006/wordprocessingDrawing" xmlns:w10="urn:schemas-microsoft-com:office:word" xmlns:w="http://schemas.openxmlformats.org/wordprocessingml/2006/main" xmlns:w14="http://schemas.microsoft.com/office/word/2010/wordml" xmlns:w15="http://schemas.microsoft.com/office/word/2012/wordml" xmlns:w16cex="http://schemas.microsoft.com/office/word/2018/wordml/cex" xmlns:w16cid="http://schemas.microsoft.com/office/word/2016/wordml/cid" xmlns:w16="http://schemas.microsoft.com/office/word/2018/wordml" xmlns:w16sdtdh="http://schemas.microsoft.com/office/word/2020/wordml/sdtdatahash" xmlns:w16se="http://schemas.microsoft.com/office/word/2015/wordml/symex" xmlns:wpg="http://schemas.microsoft.com/office/word/2010/wordprocessingGroup" xmlns:wpi="http://schemas.microsoft.com/office/word/2010/wordprocessingInk" xmlns:wne="http://schemas.microsoft.com/office/word/2006/wordml" xmlns:wps="http://schemas.microsoft.com/office/word/2010/wordprocessingShape" mc:Ignorable="w14 w15 w16se w16cid w16 w16cex w16sdtdh wp14">
+<w:footnotes xmlns:wpc="http://schemas.microsoft.com/office/word/2010/wordprocessingCanvas" xmlns:cx="http://schemas.microsoft.com/office/drawing/2014/chartex" xmlns:cx1="http://schemas.microsoft.com/office/drawing/2015/9/8/chartex" xmlns:cx2="http://schemas.microsoft.com/office/drawing/2015/10/21/chartex" xmlns:cx3="http://schemas.microsoft.com/office/drawing/2016/5/9/chartex" xmlns:cx4="http://schemas.microsoft.com/office/drawing/2016/5/10/chartex" xmlns:cx5="http://schemas.microsoft.com/office/drawing/2016/5/11/chartex" xmlns:cx6="http://schemas.microsoft.com/office/drawing/2016/5/12/chartex" xmlns:cx7="http://schemas.microsoft.com/office/drawing/2016/5/13/chartex" xmlns:cx8="http://schemas.microsoft.com/office/drawing/2016/5/14/chartex" xmlns:mc="http://schemas.openxmlformats.org/markup-compatibility/2006" xmlns:aink="http://schemas.microsoft.com/office/drawing/2016/ink" xmlns:am3d="http://schemas.microsoft.com/office/drawing/2017/model3d" xmlns:o="urn:schemas-microsoft-com:office:office" xmlns:oel="http://schemas.microsoft.com/office/2019/extlst" xmlns:r="http://schemas.openxmlformats.org/officeDocument/2006/relationships" xmlns:m="http://schemas.openxmlformats.org/officeDocument/2006/math" xmlns:v="urn:schemas-microsoft-com:vml" xmlns:wp14="http://schemas.microsoft.com/office/word/2010/wordprocessingDrawing" xmlns:wp="http://schemas.openxmlformats.org/drawingml/2006/wordprocessingDrawing" xmlns:w10="urn:schemas-microsoft-com:office:word" xmlns:w="http://schemas.openxmlformats.org/wordprocessingml/2006/main" xmlns:w14="http://schemas.microsoft.com/office/word/2010/wordml" xmlns:w15="http://schemas.microsoft.com/office/word/2012/wordml" xmlns:w16cex="http://schemas.microsoft.com/office/word/2018/wordml/cex" xmlns:w16cid="http://schemas.microsoft.com/office/word/2016/wordml/cid" xmlns:w16="http://schemas.microsoft.com/office/word/2018/wordml" xmlns:w16du="http://schemas.microsoft.com/office/word/2023/wordml/word16du" xmlns:w16sdtdh="http://schemas.microsoft.com/office/word/2020/wordml/sdtdatahash" xmlns:w16sdtfl="http://schemas.microsoft.com/office/word/2024/wordml/sdtformatlock" xmlns:w16se="http://schemas.microsoft.com/office/word/2015/wordml/symex" xmlns:wpg="http://schemas.microsoft.com/office/word/2010/wordprocessingGroup" xmlns:wpi="http://schemas.microsoft.com/office/word/2010/wordprocessingInk" xmlns:wne="http://schemas.microsoft.com/office/word/2006/wordml" xmlns:wps="http://schemas.microsoft.com/office/word/2010/wordprocessingShape" mc:Ignorable="w14 w15 w16se w16cid w16 w16cex w16sdtdh w16sdtfl w16du wp14">
   <w:footnote w:type="separator" w:id="-1">
     <w:p>
       <w:r>
@@ -4235,7 +4014,7 @@
 </file>
 
 <file path=word/header1.xml><?xml version="1.0" encoding="utf-8"?>
-<w:hdr xmlns:wpc="http://schemas.microsoft.com/office/word/2010/wordprocessingCanvas" xmlns:cx="http://schemas.microsoft.com/office/drawing/2014/chartex" xmlns:cx1="http://schemas.microsoft.com/office/drawing/2015/9/8/chartex" xmlns:cx2="http://schemas.microsoft.com/office/drawing/2015/10/21/chartex" xmlns:cx3="http://schemas.microsoft.com/office/drawing/2016/5/9/chartex" xmlns:cx4="http://schemas.microsoft.com/office/drawing/2016/5/10/chartex" xmlns:cx5="http://schemas.microsoft.com/office/drawing/2016/5/11/chartex" xmlns:cx6="http://schemas.microsoft.com/office/drawing/2016/5/12/chartex" xmlns:cx7="http://schemas.microsoft.com/office/drawing/2016/5/13/chartex" xmlns:cx8="http://schemas.microsoft.com/office/drawing/2016/5/14/chartex" xmlns:mc="http://schemas.openxmlformats.org/markup-compatibility/2006" xmlns:aink="http://schemas.microsoft.com/office/drawing/2016/ink" xmlns:am3d="http://schemas.microsoft.com/office/drawing/2017/model3d" xmlns:o="urn:schemas-microsoft-com:office:office" xmlns:oel="http://schemas.microsoft.com/office/2019/extlst" xmlns:r="http://schemas.openxmlformats.org/officeDocument/2006/relationships" xmlns:m="http://schemas.openxmlformats.org/officeDocument/2006/math" xmlns:v="urn:schemas-microsoft-com:vml" xmlns:wp14="http://schemas.microsoft.com/office/word/2010/wordprocessingDrawing" xmlns:wp="http://schemas.openxmlformats.org/drawingml/2006/wordprocessingDrawing" xmlns:w10="urn:schemas-microsoft-com:office:word" xmlns:w="http://schemas.openxmlformats.org/wordprocessingml/2006/main" xmlns:w14="http://schemas.microsoft.com/office/word/2010/wordml" xmlns:w15="http://schemas.microsoft.com/office/word/2012/wordml" xmlns:w16cex="http://schemas.microsoft.com/office/word/2018/wordml/cex" xmlns:w16cid="http://schemas.microsoft.com/office/word/2016/wordml/cid" xmlns:w16="http://schemas.microsoft.com/office/word/2018/wordml" xmlns:w16sdtdh="http://schemas.microsoft.com/office/word/2020/wordml/sdtdatahash" xmlns:w16se="http://schemas.microsoft.com/office/word/2015/wordml/symex" xmlns:wpg="http://schemas.microsoft.com/office/word/2010/wordprocessingGroup" xmlns:wpi="http://schemas.microsoft.com/office/word/2010/wordprocessingInk" xmlns:wne="http://schemas.microsoft.com/office/word/2006/wordml" xmlns:wps="http://schemas.microsoft.com/office/word/2010/wordprocessingShape" mc:Ignorable="w14 w15 w16se w16cid w16 w16cex w16sdtdh wp14">
+<w:hdr xmlns:wpc="http://schemas.microsoft.com/office/word/2010/wordprocessingCanvas" xmlns:cx="http://schemas.microsoft.com/office/drawing/2014/chartex" xmlns:cx1="http://schemas.microsoft.com/office/drawing/2015/9/8/chartex" xmlns:cx2="http://schemas.microsoft.com/office/drawing/2015/10/21/chartex" xmlns:cx3="http://schemas.microsoft.com/office/drawing/2016/5/9/chartex" xmlns:cx4="http://schemas.microsoft.com/office/drawing/2016/5/10/chartex" xmlns:cx5="http://schemas.microsoft.com/office/drawing/2016/5/11/chartex" xmlns:cx6="http://schemas.microsoft.com/office/drawing/2016/5/12/chartex" xmlns:cx7="http://schemas.microsoft.com/office/drawing/2016/5/13/chartex" xmlns:cx8="http://schemas.microsoft.com/office/drawing/2016/5/14/chartex" xmlns:mc="http://schemas.openxmlformats.org/markup-compatibility/2006" xmlns:aink="http://schemas.microsoft.com/office/drawing/2016/ink" xmlns:am3d="http://schemas.microsoft.com/office/drawing/2017/model3d" xmlns:o="urn:schemas-microsoft-com:office:office" xmlns:oel="http://schemas.microsoft.com/office/2019/extlst" xmlns:r="http://schemas.openxmlformats.org/officeDocument/2006/relationships" xmlns:m="http://schemas.openxmlformats.org/officeDocument/2006/math" xmlns:v="urn:schemas-microsoft-com:vml" xmlns:wp14="http://schemas.microsoft.com/office/word/2010/wordprocessingDrawing" xmlns:wp="http://schemas.openxmlformats.org/drawingml/2006/wordprocessingDrawing" xmlns:w10="urn:schemas-microsoft-com:office:word" xmlns:w="http://schemas.openxmlformats.org/wordprocessingml/2006/main" xmlns:w14="http://schemas.microsoft.com/office/word/2010/wordml" xmlns:w15="http://schemas.microsoft.com/office/word/2012/wordml" xmlns:w16cex="http://schemas.microsoft.com/office/word/2018/wordml/cex" xmlns:w16cid="http://schemas.microsoft.com/office/word/2016/wordml/cid" xmlns:w16="http://schemas.microsoft.com/office/word/2018/wordml" xmlns:w16du="http://schemas.microsoft.com/office/word/2023/wordml/word16du" xmlns:w16sdtdh="http://schemas.microsoft.com/office/word/2020/wordml/sdtdatahash" xmlns:w16sdtfl="http://schemas.microsoft.com/office/word/2024/wordml/sdtformatlock" xmlns:w16se="http://schemas.microsoft.com/office/word/2015/wordml/symex" xmlns:wpg="http://schemas.microsoft.com/office/word/2010/wordprocessingGroup" xmlns:wpi="http://schemas.microsoft.com/office/word/2010/wordprocessingInk" xmlns:wne="http://schemas.microsoft.com/office/word/2006/wordml" xmlns:wps="http://schemas.microsoft.com/office/word/2010/wordprocessingShape" mc:Ignorable="w14 w15 w16se w16cid w16 w16cex w16sdtdh w16sdtfl w16du wp14">
   <w:p>
     <w:pPr>
       <w:pStyle w:val="Header"/>
@@ -4284,7 +4063,25 @@
         <w:sz w:val="18"/>
         <w:szCs w:val="18"/>
       </w:rPr>
-      <w:t>Farm Platform Access Request Form V12.docx</w:t>
+      <w:t>Farm Platform Access Request Form V1</w:t>
+    </w:r>
+    <w:r>
+      <w:rPr>
+        <w:i/>
+        <w:noProof/>
+        <w:sz w:val="18"/>
+        <w:szCs w:val="18"/>
+      </w:rPr>
+      <w:t>3</w:t>
+    </w:r>
+    <w:r>
+      <w:rPr>
+        <w:i/>
+        <w:noProof/>
+        <w:sz w:val="18"/>
+        <w:szCs w:val="18"/>
+      </w:rPr>
+      <w:t>.docx</w:t>
     </w:r>
     <w:r>
       <w:rPr>
@@ -4301,7 +4098,30 @@
         <w:szCs w:val="18"/>
       </w:rPr>
       <w:tab/>
-      <w:t>Jane Hawkins</w:t>
+    </w:r>
+    <w:r>
+      <w:rPr>
+        <w:i/>
+        <w:sz w:val="18"/>
+        <w:szCs w:val="18"/>
+      </w:rPr>
+      <w:t>Paul</w:t>
+    </w:r>
+    <w:r>
+      <w:rPr>
+        <w:i/>
+        <w:sz w:val="18"/>
+        <w:szCs w:val="18"/>
+      </w:rPr>
+      <w:t xml:space="preserve"> Ha</w:t>
+    </w:r>
+    <w:r>
+      <w:rPr>
+        <w:i/>
+        <w:sz w:val="18"/>
+        <w:szCs w:val="18"/>
+      </w:rPr>
+      <w:t>rris</w:t>
     </w:r>
   </w:p>
   <w:p>
@@ -4313,7 +4133,7 @@
 </file>
 
 <file path=word/numbering.xml><?xml version="1.0" encoding="utf-8"?>
-<w:numbering xmlns:wpc="http://schemas.microsoft.com/office/word/2010/wordprocessingCanvas" xmlns:cx="http://schemas.microsoft.com/office/drawing/2014/chartex" xmlns:cx1="http://schemas.microsoft.com/office/drawing/2015/9/8/chartex" xmlns:cx2="http://schemas.microsoft.com/office/drawing/2015/10/21/chartex" xmlns:cx3="http://schemas.microsoft.com/office/drawing/2016/5/9/chartex" xmlns:cx4="http://schemas.microsoft.com/office/drawing/2016/5/10/chartex" xmlns:cx5="http://schemas.microsoft.com/office/drawing/2016/5/11/chartex" xmlns:cx6="http://schemas.microsoft.com/office/drawing/2016/5/12/chartex" xmlns:cx7="http://schemas.microsoft.com/office/drawing/2016/5/13/chartex" xmlns:cx8="http://schemas.microsoft.com/office/drawing/2016/5/14/chartex" xmlns:mc="http://schemas.openxmlformats.org/markup-compatibility/2006" xmlns:aink="http://schemas.microsoft.com/office/drawing/2016/ink" xmlns:am3d="http://schemas.microsoft.com/office/drawing/2017/model3d" xmlns:o="urn:schemas-microsoft-com:office:office" xmlns:oel="http://schemas.microsoft.com/office/2019/extlst" xmlns:r="http://schemas.openxmlformats.org/officeDocument/2006/relationships" xmlns:m="http://schemas.openxmlformats.org/officeDocument/2006/math" xmlns:v="urn:schemas-microsoft-com:vml" xmlns:wp14="http://schemas.microsoft.com/office/word/2010/wordprocessingDrawing" xmlns:wp="http://schemas.openxmlformats.org/drawingml/2006/wordprocessingDrawing" xmlns:w10="urn:schemas-microsoft-com:office:word" xmlns:w="http://schemas.openxmlformats.org/wordprocessingml/2006/main" xmlns:w14="http://schemas.microsoft.com/office/word/2010/wordml" xmlns:w15="http://schemas.microsoft.com/office/word/2012/wordml" xmlns:w16cex="http://schemas.microsoft.com/office/word/2018/wordml/cex" xmlns:w16cid="http://schemas.microsoft.com/office/word/2016/wordml/cid" xmlns:w16="http://schemas.microsoft.com/office/word/2018/wordml" xmlns:w16sdtdh="http://schemas.microsoft.com/office/word/2020/wordml/sdtdatahash" xmlns:w16se="http://schemas.microsoft.com/office/word/2015/wordml/symex" xmlns:wpg="http://schemas.microsoft.com/office/word/2010/wordprocessingGroup" xmlns:wpi="http://schemas.microsoft.com/office/word/2010/wordprocessingInk" xmlns:wne="http://schemas.microsoft.com/office/word/2006/wordml" xmlns:wps="http://schemas.microsoft.com/office/word/2010/wordprocessingShape" mc:Ignorable="w14 w15 w16se w16cid w16 w16cex w16sdtdh wp14">
+<w:numbering xmlns:wpc="http://schemas.microsoft.com/office/word/2010/wordprocessingCanvas" xmlns:cx="http://schemas.microsoft.com/office/drawing/2014/chartex" xmlns:cx1="http://schemas.microsoft.com/office/drawing/2015/9/8/chartex" xmlns:cx2="http://schemas.microsoft.com/office/drawing/2015/10/21/chartex" xmlns:cx3="http://schemas.microsoft.com/office/drawing/2016/5/9/chartex" xmlns:cx4="http://schemas.microsoft.com/office/drawing/2016/5/10/chartex" xmlns:cx5="http://schemas.microsoft.com/office/drawing/2016/5/11/chartex" xmlns:cx6="http://schemas.microsoft.com/office/drawing/2016/5/12/chartex" xmlns:cx7="http://schemas.microsoft.com/office/drawing/2016/5/13/chartex" xmlns:cx8="http://schemas.microsoft.com/office/drawing/2016/5/14/chartex" xmlns:mc="http://schemas.openxmlformats.org/markup-compatibility/2006" xmlns:aink="http://schemas.microsoft.com/office/drawing/2016/ink" xmlns:am3d="http://schemas.microsoft.com/office/drawing/2017/model3d" xmlns:o="urn:schemas-microsoft-com:office:office" xmlns:oel="http://schemas.microsoft.com/office/2019/extlst" xmlns:r="http://schemas.openxmlformats.org/officeDocument/2006/relationships" xmlns:m="http://schemas.openxmlformats.org/officeDocument/2006/math" xmlns:v="urn:schemas-microsoft-com:vml" xmlns:wp14="http://schemas.microsoft.com/office/word/2010/wordprocessingDrawing" xmlns:wp="http://schemas.openxmlformats.org/drawingml/2006/wordprocessingDrawing" xmlns:w10="urn:schemas-microsoft-com:office:word" xmlns:w="http://schemas.openxmlformats.org/wordprocessingml/2006/main" xmlns:w14="http://schemas.microsoft.com/office/word/2010/wordml" xmlns:w15="http://schemas.microsoft.com/office/word/2012/wordml" xmlns:w16cex="http://schemas.microsoft.com/office/word/2018/wordml/cex" xmlns:w16cid="http://schemas.microsoft.com/office/word/2016/wordml/cid" xmlns:w16="http://schemas.microsoft.com/office/word/2018/wordml" xmlns:w16du="http://schemas.microsoft.com/office/word/2023/wordml/word16du" xmlns:w16sdtdh="http://schemas.microsoft.com/office/word/2020/wordml/sdtdatahash" xmlns:w16sdtfl="http://schemas.microsoft.com/office/word/2024/wordml/sdtformatlock" xmlns:w16se="http://schemas.microsoft.com/office/word/2015/wordml/symex" xmlns:wpg="http://schemas.microsoft.com/office/word/2010/wordprocessingGroup" xmlns:wpi="http://schemas.microsoft.com/office/word/2010/wordprocessingInk" xmlns:wne="http://schemas.microsoft.com/office/word/2006/wordml" xmlns:wps="http://schemas.microsoft.com/office/word/2010/wordprocessingShape" mc:Ignorable="w14 w15 w16se w16cid w16 w16cex w16sdtdh w16sdtfl w16du wp14">
   <w:abstractNum w:abstractNumId="0" w15:restartNumberingAfterBreak="0">
     <w:nsid w:val="097505B3"/>
     <w:multiLevelType w:val="multilevel"/>
@@ -5103,7 +4923,7 @@
 </file>
 
 <file path=word/styles.xml><?xml version="1.0" encoding="utf-8"?>
-<w:styles xmlns:mc="http://schemas.openxmlformats.org/markup-compatibility/2006" xmlns:r="http://schemas.openxmlformats.org/officeDocument/2006/relationships" xmlns:w="http://schemas.openxmlformats.org/wordprocessingml/2006/main" xmlns:w14="http://schemas.microsoft.com/office/word/2010/wordml" xmlns:w15="http://schemas.microsoft.com/office/word/2012/wordml" xmlns:w16cex="http://schemas.microsoft.com/office/word/2018/wordml/cex" xmlns:w16cid="http://schemas.microsoft.com/office/word/2016/wordml/cid" xmlns:w16="http://schemas.microsoft.com/office/word/2018/wordml" xmlns:w16sdtdh="http://schemas.microsoft.com/office/word/2020/wordml/sdtdatahash" xmlns:w16se="http://schemas.microsoft.com/office/word/2015/wordml/symex" mc:Ignorable="w14 w15 w16se w16cid w16 w16cex w16sdtdh">
+<w:styles xmlns:mc="http://schemas.openxmlformats.org/markup-compatibility/2006" xmlns:r="http://schemas.openxmlformats.org/officeDocument/2006/relationships" xmlns:w="http://schemas.openxmlformats.org/wordprocessingml/2006/main" xmlns:w14="http://schemas.microsoft.com/office/word/2010/wordml" xmlns:w15="http://schemas.microsoft.com/office/word/2012/wordml" xmlns:w16cex="http://schemas.microsoft.com/office/word/2018/wordml/cex" xmlns:w16cid="http://schemas.microsoft.com/office/word/2016/wordml/cid" xmlns:w16="http://schemas.microsoft.com/office/word/2018/wordml" xmlns:w16du="http://schemas.microsoft.com/office/word/2023/wordml/word16du" xmlns:w16sdtdh="http://schemas.microsoft.com/office/word/2020/wordml/sdtdatahash" xmlns:w16sdtfl="http://schemas.microsoft.com/office/word/2024/wordml/sdtformatlock" xmlns:w16se="http://schemas.microsoft.com/office/word/2015/wordml/symex" mc:Ignorable="w14 w15 w16se w16cid w16 w16cex w16sdtdh w16sdtfl w16du">
   <w:docDefaults>
     <w:rPrDefault>
       <w:rPr>
@@ -6013,10 +5833,243 @@
 <b:Sources xmlns:b="http://schemas.openxmlformats.org/officeDocument/2006/bibliography" xmlns="http://schemas.openxmlformats.org/officeDocument/2006/bibliography" SelectedStyle="\APASixthEditionOfficeOnline.xsl" StyleName="APA" Version="6"/>
 </file>
 
+<file path=customXml/item2.xml><?xml version="1.0" encoding="utf-8"?>
+<ct:contentTypeSchema xmlns:ct="http://schemas.microsoft.com/office/2006/metadata/contentType" xmlns:ma="http://schemas.microsoft.com/office/2006/metadata/properties/metaAttributes" ct:_="" ma:_="" ma:contentTypeName="Document" ma:contentTypeID="0x010100F9D8E35C77E05F488DB34CEE45B62F6E" ma:contentTypeVersion="12" ma:contentTypeDescription="Create a new document." ma:contentTypeScope="" ma:versionID="17e062ced5d9a43fac130a2c05c1d30c">
+  <xsd:schema xmlns:xsd="http://www.w3.org/2001/XMLSchema" xmlns:xs="http://www.w3.org/2001/XMLSchema" xmlns:p="http://schemas.microsoft.com/office/2006/metadata/properties" xmlns:ns2="a6b45d3c-4104-4498-b4ca-e2c1e14bcaec" xmlns:ns3="409f43f0-a65a-4dac-bb6f-9d131caeac16" targetNamespace="http://schemas.microsoft.com/office/2006/metadata/properties" ma:root="true" ma:fieldsID="1013cbe60f171fbcc94c8a684b99558a" ns2:_="" ns3:_="">
+    <xsd:import namespace="a6b45d3c-4104-4498-b4ca-e2c1e14bcaec"/>
+    <xsd:import namespace="409f43f0-a65a-4dac-bb6f-9d131caeac16"/>
+    <xsd:element name="properties">
+      <xsd:complexType>
+        <xsd:sequence>
+          <xsd:element name="documentManagement">
+            <xsd:complexType>
+              <xsd:all>
+                <xsd:element ref="ns2:MediaServiceMetadata" minOccurs="0"/>
+                <xsd:element ref="ns2:MediaServiceFastMetadata" minOccurs="0"/>
+                <xsd:element ref="ns2:MediaServiceSearchProperties" minOccurs="0"/>
+                <xsd:element ref="ns2:MediaServiceObjectDetectorVersions" minOccurs="0"/>
+                <xsd:element ref="ns2:lcf76f155ced4ddcb4097134ff3c332f" minOccurs="0"/>
+                <xsd:element ref="ns3:TaxCatchAll" minOccurs="0"/>
+                <xsd:element ref="ns2:MediaServiceOCR" minOccurs="0"/>
+                <xsd:element ref="ns2:MediaServiceGenerationTime" minOccurs="0"/>
+                <xsd:element ref="ns2:MediaServiceEventHashCode" minOccurs="0"/>
+                <xsd:element ref="ns2:MediaServiceDateTaken" minOccurs="0"/>
+                <xsd:element ref="ns2:MediaLengthInSeconds" minOccurs="0"/>
+              </xsd:all>
+            </xsd:complexType>
+          </xsd:element>
+        </xsd:sequence>
+      </xsd:complexType>
+    </xsd:element>
+  </xsd:schema>
+  <xsd:schema xmlns:xsd="http://www.w3.org/2001/XMLSchema" xmlns:xs="http://www.w3.org/2001/XMLSchema" xmlns:dms="http://schemas.microsoft.com/office/2006/documentManagement/types" xmlns:pc="http://schemas.microsoft.com/office/infopath/2007/PartnerControls" targetNamespace="a6b45d3c-4104-4498-b4ca-e2c1e14bcaec" elementFormDefault="qualified">
+    <xsd:import namespace="http://schemas.microsoft.com/office/2006/documentManagement/types"/>
+    <xsd:import namespace="http://schemas.microsoft.com/office/infopath/2007/PartnerControls"/>
+    <xsd:element name="MediaServiceMetadata" ma:index="8" nillable="true" ma:displayName="MediaServiceMetadata" ma:hidden="true" ma:internalName="MediaServiceMetadata" ma:readOnly="true">
+      <xsd:simpleType>
+        <xsd:restriction base="dms:Note"/>
+      </xsd:simpleType>
+    </xsd:element>
+    <xsd:element name="MediaServiceFastMetadata" ma:index="9" nillable="true" ma:displayName="MediaServiceFastMetadata" ma:hidden="true" ma:internalName="MediaServiceFastMetadata" ma:readOnly="true">
+      <xsd:simpleType>
+        <xsd:restriction base="dms:Note"/>
+      </xsd:simpleType>
+    </xsd:element>
+    <xsd:element name="MediaServiceSearchProperties" ma:index="10" nillable="true" ma:displayName="MediaServiceSearchProperties" ma:hidden="true" ma:internalName="MediaServiceSearchProperties" ma:readOnly="true">
+      <xsd:simpleType>
+        <xsd:restriction base="dms:Note"/>
+      </xsd:simpleType>
+    </xsd:element>
+    <xsd:element name="MediaServiceObjectDetectorVersions" ma:index="11" nillable="true" ma:displayName="MediaServiceObjectDetectorVersions" ma:hidden="true" ma:indexed="true" ma:internalName="MediaServiceObjectDetectorVersions" ma:readOnly="true">
+      <xsd:simpleType>
+        <xsd:restriction base="dms:Text"/>
+      </xsd:simpleType>
+    </xsd:element>
+    <xsd:element name="lcf76f155ced4ddcb4097134ff3c332f" ma:index="13" nillable="true" ma:taxonomy="true" ma:internalName="lcf76f155ced4ddcb4097134ff3c332f" ma:taxonomyFieldName="MediaServiceImageTags" ma:displayName="Image Tags" ma:readOnly="false" ma:fieldId="{5cf76f15-5ced-4ddc-b409-7134ff3c332f}" ma:taxonomyMulti="true" ma:sspId="7890e11c-1d58-4a8b-9e3e-7b4984dfdb43" ma:termSetId="09814cd3-568e-fe90-9814-8d621ff8fb84" ma:anchorId="fba54fb3-c3e1-fe81-a776-ca4b69148c4d" ma:open="true" ma:isKeyword="false">
+      <xsd:complexType>
+        <xsd:sequence>
+          <xsd:element ref="pc:Terms" minOccurs="0" maxOccurs="1"/>
+        </xsd:sequence>
+      </xsd:complexType>
+    </xsd:element>
+    <xsd:element name="MediaServiceOCR" ma:index="15" nillable="true" ma:displayName="Extracted Text" ma:internalName="MediaServiceOCR" ma:readOnly="true">
+      <xsd:simpleType>
+        <xsd:restriction base="dms:Note">
+          <xsd:maxLength value="255"/>
+        </xsd:restriction>
+      </xsd:simpleType>
+    </xsd:element>
+    <xsd:element name="MediaServiceGenerationTime" ma:index="16" nillable="true" ma:displayName="MediaServiceGenerationTime" ma:hidden="true" ma:internalName="MediaServiceGenerationTime" ma:readOnly="true">
+      <xsd:simpleType>
+        <xsd:restriction base="dms:Text"/>
+      </xsd:simpleType>
+    </xsd:element>
+    <xsd:element name="MediaServiceEventHashCode" ma:index="17" nillable="true" ma:displayName="MediaServiceEventHashCode" ma:hidden="true" ma:internalName="MediaServiceEventHashCode" ma:readOnly="true">
+      <xsd:simpleType>
+        <xsd:restriction base="dms:Text"/>
+      </xsd:simpleType>
+    </xsd:element>
+    <xsd:element name="MediaServiceDateTaken" ma:index="18" nillable="true" ma:displayName="MediaServiceDateTaken" ma:hidden="true" ma:indexed="true" ma:internalName="MediaServiceDateTaken" ma:readOnly="true">
+      <xsd:simpleType>
+        <xsd:restriction base="dms:Text"/>
+      </xsd:simpleType>
+    </xsd:element>
+    <xsd:element name="MediaLengthInSeconds" ma:index="19" nillable="true" ma:displayName="MediaLengthInSeconds" ma:hidden="true" ma:internalName="MediaLengthInSeconds" ma:readOnly="true">
+      <xsd:simpleType>
+        <xsd:restriction base="dms:Unknown"/>
+      </xsd:simpleType>
+    </xsd:element>
+  </xsd:schema>
+  <xsd:schema xmlns:xsd="http://www.w3.org/2001/XMLSchema" xmlns:xs="http://www.w3.org/2001/XMLSchema" xmlns:dms="http://schemas.microsoft.com/office/2006/documentManagement/types" xmlns:pc="http://schemas.microsoft.com/office/infopath/2007/PartnerControls" targetNamespace="409f43f0-a65a-4dac-bb6f-9d131caeac16" elementFormDefault="qualified">
+    <xsd:import namespace="http://schemas.microsoft.com/office/2006/documentManagement/types"/>
+    <xsd:import namespace="http://schemas.microsoft.com/office/infopath/2007/PartnerControls"/>
+    <xsd:element name="TaxCatchAll" ma:index="14" nillable="true" ma:displayName="Taxonomy Catch All Column" ma:hidden="true" ma:list="{7d553aaa-e660-4050-82bc-153ad1c18d7b}" ma:internalName="TaxCatchAll" ma:showField="CatchAllData" ma:web="409f43f0-a65a-4dac-bb6f-9d131caeac16">
+      <xsd:complexType>
+        <xsd:complexContent>
+          <xsd:extension base="dms:MultiChoiceLookup">
+            <xsd:sequence>
+              <xsd:element name="Value" type="dms:Lookup" maxOccurs="unbounded" minOccurs="0" nillable="true"/>
+            </xsd:sequence>
+          </xsd:extension>
+        </xsd:complexContent>
+      </xsd:complexType>
+    </xsd:element>
+  </xsd:schema>
+  <xsd:schema xmlns="http://schemas.openxmlformats.org/package/2006/metadata/core-properties" xmlns:xsd="http://www.w3.org/2001/XMLSchema" xmlns:xsi="http://www.w3.org/2001/XMLSchema-instance" xmlns:dc="http://purl.org/dc/elements/1.1/" xmlns:dcterms="http://purl.org/dc/terms/" xmlns:odoc="http://schemas.microsoft.com/internal/obd" targetNamespace="http://schemas.openxmlformats.org/package/2006/metadata/core-properties" elementFormDefault="qualified" attributeFormDefault="unqualified" blockDefault="#all">
+    <xsd:import namespace="http://purl.org/dc/elements/1.1/" schemaLocation="http://dublincore.org/schemas/xmls/qdc/2003/04/02/dc.xsd"/>
+    <xsd:import namespace="http://purl.org/dc/terms/" schemaLocation="http://dublincore.org/schemas/xmls/qdc/2003/04/02/dcterms.xsd"/>
+    <xsd:element name="coreProperties" type="CT_coreProperties"/>
+    <xsd:complexType name="CT_coreProperties">
+      <xsd:all>
+        <xsd:element ref="dc:creator" minOccurs="0" maxOccurs="1"/>
+        <xsd:element ref="dcterms:created" minOccurs="0" maxOccurs="1"/>
+        <xsd:element ref="dc:identifier" minOccurs="0" maxOccurs="1"/>
+        <xsd:element name="contentType" minOccurs="0" maxOccurs="1" type="xsd:string" ma:index="0" ma:displayName="Content Type"/>
+        <xsd:element ref="dc:title" minOccurs="0" maxOccurs="1" ma:index="4" ma:displayName="Title"/>
+        <xsd:element ref="dc:subject" minOccurs="0" maxOccurs="1"/>
+        <xsd:element ref="dc:description" minOccurs="0" maxOccurs="1"/>
+        <xsd:element name="keywords" minOccurs="0" maxOccurs="1" type="xsd:string"/>
+        <xsd:element ref="dc:language" minOccurs="0" maxOccurs="1"/>
+        <xsd:element name="category" minOccurs="0" maxOccurs="1" type="xsd:string"/>
+        <xsd:element name="version" minOccurs="0" maxOccurs="1" type="xsd:string"/>
+        <xsd:element name="revision" minOccurs="0" maxOccurs="1" type="xsd:string">
+          <xsd:annotation>
+            <xsd:documentation>
+                        This value indicates the number of saves or revisions. The application is responsible for updating this value after each revision.
+                    </xsd:documentation>
+          </xsd:annotation>
+        </xsd:element>
+        <xsd:element name="lastModifiedBy" minOccurs="0" maxOccurs="1" type="xsd:string"/>
+        <xsd:element ref="dcterms:modified" minOccurs="0" maxOccurs="1"/>
+        <xsd:element name="contentStatus" minOccurs="0" maxOccurs="1" type="xsd:string"/>
+      </xsd:all>
+    </xsd:complexType>
+  </xsd:schema>
+  <xs:schema xmlns:pc="http://schemas.microsoft.com/office/infopath/2007/PartnerControls" xmlns:xs="http://www.w3.org/2001/XMLSchema" targetNamespace="http://schemas.microsoft.com/office/infopath/2007/PartnerControls" elementFormDefault="qualified" attributeFormDefault="unqualified">
+    <xs:element name="Person">
+      <xs:complexType>
+        <xs:sequence>
+          <xs:element ref="pc:DisplayName" minOccurs="0"/>
+          <xs:element ref="pc:AccountId" minOccurs="0"/>
+          <xs:element ref="pc:AccountType" minOccurs="0"/>
+        </xs:sequence>
+      </xs:complexType>
+    </xs:element>
+    <xs:element name="DisplayName" type="xs:string"/>
+    <xs:element name="AccountId" type="xs:string"/>
+    <xs:element name="AccountType" type="xs:string"/>
+    <xs:element name="BDCAssociatedEntity">
+      <xs:complexType>
+        <xs:sequence>
+          <xs:element ref="pc:BDCEntity" minOccurs="0" maxOccurs="unbounded"/>
+        </xs:sequence>
+        <xs:attribute ref="pc:EntityNamespace"/>
+        <xs:attribute ref="pc:EntityName"/>
+        <xs:attribute ref="pc:SystemInstanceName"/>
+        <xs:attribute ref="pc:AssociationName"/>
+      </xs:complexType>
+    </xs:element>
+    <xs:attribute name="EntityNamespace" type="xs:string"/>
+    <xs:attribute name="EntityName" type="xs:string"/>
+    <xs:attribute name="SystemInstanceName" type="xs:string"/>
+    <xs:attribute name="AssociationName" type="xs:string"/>
+    <xs:element name="BDCEntity">
+      <xs:complexType>
+        <xs:sequence>
+          <xs:element ref="pc:EntityDisplayName" minOccurs="0"/>
+          <xs:element ref="pc:EntityInstanceReference" minOccurs="0"/>
+          <xs:element ref="pc:EntityId1" minOccurs="0"/>
+          <xs:element ref="pc:EntityId2" minOccurs="0"/>
+          <xs:element ref="pc:EntityId3" minOccurs="0"/>
+          <xs:element ref="pc:EntityId4" minOccurs="0"/>
+          <xs:element ref="pc:EntityId5" minOccurs="0"/>
+        </xs:sequence>
+      </xs:complexType>
+    </xs:element>
+    <xs:element name="EntityDisplayName" type="xs:string"/>
+    <xs:element name="EntityInstanceReference" type="xs:string"/>
+    <xs:element name="EntityId1" type="xs:string"/>
+    <xs:element name="EntityId2" type="xs:string"/>
+    <xs:element name="EntityId3" type="xs:string"/>
+    <xs:element name="EntityId4" type="xs:string"/>
+    <xs:element name="EntityId5" type="xs:string"/>
+    <xs:element name="Terms">
+      <xs:complexType>
+        <xs:sequence>
+          <xs:element ref="pc:TermInfo" minOccurs="0" maxOccurs="unbounded"/>
+        </xs:sequence>
+      </xs:complexType>
+    </xs:element>
+    <xs:element name="TermInfo">
+      <xs:complexType>
+        <xs:sequence>
+          <xs:element ref="pc:TermName" minOccurs="0"/>
+          <xs:element ref="pc:TermId" minOccurs="0"/>
+        </xs:sequence>
+      </xs:complexType>
+    </xs:element>
+    <xs:element name="TermName" type="xs:string"/>
+    <xs:element name="TermId" type="xs:string"/>
+  </xs:schema>
+</ct:contentTypeSchema>
+</file>
+
+<file path=customXml/item3.xml><?xml version="1.0" encoding="utf-8"?>
+<?mso-contentType ?>
+<FormTemplates xmlns="http://schemas.microsoft.com/sharepoint/v3/contenttype/forms">
+  <Display>DocumentLibraryForm</Display>
+  <Edit>DocumentLibraryForm</Edit>
+  <New>DocumentLibraryForm</New>
+</FormTemplates>
+</file>
+
+<file path=customXml/item4.xml><?xml version="1.0" encoding="utf-8"?>
+<p:properties xmlns:p="http://schemas.microsoft.com/office/2006/metadata/properties" xmlns:xsi="http://www.w3.org/2001/XMLSchema-instance" xmlns:pc="http://schemas.microsoft.com/office/infopath/2007/PartnerControls">
+  <documentManagement>
+    <lcf76f155ced4ddcb4097134ff3c332f xmlns="a6b45d3c-4104-4498-b4ca-e2c1e14bcaec">
+      <Terms xmlns="http://schemas.microsoft.com/office/infopath/2007/PartnerControls"/>
+    </lcf76f155ced4ddcb4097134ff3c332f>
+    <TaxCatchAll xmlns="409f43f0-a65a-4dac-bb6f-9d131caeac16" xsi:nil="true"/>
+  </documentManagement>
+</p:properties>
+</file>
+
 <file path=customXml/itemProps1.xml><?xml version="1.0" encoding="utf-8"?>
 <ds:datastoreItem xmlns:ds="http://schemas.openxmlformats.org/officeDocument/2006/customXml" ds:itemID="{28230826-C19B-4370-9941-19BB4A2DFF97}">
   <ds:schemaRefs>
     <ds:schemaRef ds:uri="http://schemas.openxmlformats.org/officeDocument/2006/bibliography"/>
   </ds:schemaRefs>
 </ds:datastoreItem>
+</file>
+
+<file path=customXml/itemProps2.xml><?xml version="1.0" encoding="utf-8"?>
+<ds:datastoreItem xmlns:ds="http://schemas.openxmlformats.org/officeDocument/2006/customXml" ds:itemID="{7B14DEC7-B0D1-46E4-B8FA-57C63D01DB26}"/>
+</file>
+
+<file path=customXml/itemProps3.xml><?xml version="1.0" encoding="utf-8"?>
+<ds:datastoreItem xmlns:ds="http://schemas.openxmlformats.org/officeDocument/2006/customXml" ds:itemID="{E74ED867-8F61-4AD3-A15E-ACA7BB85A095}"/>
+</file>
+
+<file path=customXml/itemProps4.xml><?xml version="1.0" encoding="utf-8"?>
+<ds:datastoreItem xmlns:ds="http://schemas.openxmlformats.org/officeDocument/2006/customXml" ds:itemID="{5E13BD20-72AC-411F-9AB9-28CEADF5B4E8}"/>
 </file>
</xml_diff>